<commit_message>
after font style and other things were added
</commit_message>
<xml_diff>
--- a/static/resumes/Yallaiah_Onteru.docx
+++ b/static/resumes/Yallaiah_Onteru.docx
@@ -59,31 +59,7 @@
         <w:rPr>
           <w:sz w:val="22"/>
         </w:rPr>
-        <w:t>5.8+ years of experience as a Data Engineer specializing in Big Data technologies, Cloud Platforms (Azure &amp; AWS), and data pipeline architecture, with a focus on the insurance and finance sectors.</w:t>
-      </w:r>
-    </w:p>
-    <w:p>
-      <w:pPr>
-        <w:pStyle w:val="ListBullet"/>
-        <w:jc w:val="both"/>
-      </w:pPr>
-      <w:r>
-        <w:rPr>
-          <w:sz w:val="22"/>
-        </w:rPr>
-        <w:t>Expertise in designing scalable ETL/ELT workflows and real-time streaming pipelines using Apache Spark (Scala, PySpark, Java), ADF, NiFi, Kafka, Kinesis, and Airflow.</w:t>
-      </w:r>
-    </w:p>
-    <w:p>
-      <w:pPr>
-        <w:pStyle w:val="ListBullet"/>
-        <w:jc w:val="both"/>
-      </w:pPr>
-      <w:r>
-        <w:rPr>
-          <w:sz w:val="22"/>
-        </w:rPr>
-        <w:t>Proficient in Azure services including Data Factory (ADF), ADLS, Synapse Analytics, Azure SQL DB, Cosmos DB, HDInsight, Azure Key Vault, Service Fabric, and Azure DevOps.</w:t>
+        <w:t>Over 5.8 years of experience as a Data Engineer with expertise in Big Data technologies, Cloud Platforms (Azure, AWS), and data pipeline architecture. Skilled in designing scalable ETL/ELT workflows, real-time streaming pipelines, and data lakes. Proficient in Azure, AWS, and Hadoop ecosystems with a focus on insurance and finance sectors. Experience with ML model deployment and feature engineering. Agile project management and leadership skills.</w:t>
       </w:r>
     </w:p>
     <w:p>
@@ -179,7 +155,7 @@
           <w:b w:val="0"/>
           <w:sz w:val="22"/>
         </w:rPr>
-        <w:t>AWS (S3, EMR, Glue, Lambda, Redshift, Kinesis, Athena, EC2, IAM, RDS, CloudWatch, Quicksight), Azure (ADF, ADLS, Synapse, Databricks, Azure SQL DB, Cosmos DB, HDInsight, Key Vault, Service Fabric, DevOps)</w:t>
+        <w:t>AWS (S3, EMR, Glue, Lambda, Redshift, Neptune, SageMaker), Azure (ADF, ADLS, Synapse, Databricks, Azure Boards)</w:t>
       </w:r>
     </w:p>
     <w:p>
@@ -221,7 +197,7 @@
           <w:b w:val="0"/>
           <w:sz w:val="22"/>
         </w:rPr>
-        <w:t>Dimensional modeling, Star/Snowflake schema, Data Lakes, Data Marts, MLOps, MLflow, Kubeflow</w:t>
+        <w:t>Dimensional modeling, Star/Snowflake schema, Data Lakes, Data Marts</w:t>
       </w:r>
     </w:p>
     <w:p>
@@ -284,7 +260,7 @@
           <w:b w:val="0"/>
           <w:sz w:val="22"/>
         </w:rPr>
-        <w:t>LLM, M-Llib, Scikit-learn, pandas, NumPy, pytorch, LangChain, RAG, GPT, Prompt Engineering, AI/ML model development, deployment and optimization, TensorFlow, PyTorch, Scikit-learn, ML algorithms, supervised learning, unsupervised learning, reinforcement learning, data preprocessing, SQL, NoSQL databases, natural language processing, computer vision, recommendation systems, big data technologies, Spark, Hadoop, data visualization tools</w:t>
+        <w:t>LLM, M-Llib, Scikit-learn, Pandas, NumPy, PyTorch, LangChain, RAG, GPT, Prompt Engineering</w:t>
       </w:r>
     </w:p>
     <w:p>
@@ -393,7 +369,7 @@
         <w:rPr>
           <w:sz w:val="22"/>
         </w:rPr>
-        <w:t>Designed and implemented enterprise-grade ETL pipelines with Azure Databricks and Apache Spark, processing 10TB of insurance policy data daily for underwriting and risk analysis, utilizing advanced ML algorithms for enhanced data processing.</w:t>
+        <w:t>Designed and implemented enterprise-grade ETL pipelines with Azure Databricks and Apache Spark, processing 10TB of insurance policy data daily for underwriting and risk analysis.</w:t>
       </w:r>
     </w:p>
     <w:p>
@@ -405,7 +381,7 @@
         <w:rPr>
           <w:sz w:val="22"/>
         </w:rPr>
-        <w:t>Led the architecture and development of a Data Mart in the CDP Layer, feeding data to 22 AI/ML models and enhancing real-time analytics for report generation, ensuring data-driven insights.</w:t>
+        <w:t>Led the architecture and development of a Data Mart in the CDP Layer, integrating data from various sources and feeding 22 AI models for automated report generation and real-time analytics.</w:t>
       </w:r>
     </w:p>
     <w:p>
@@ -417,7 +393,7 @@
         <w:rPr>
           <w:sz w:val="22"/>
         </w:rPr>
-        <w:t>Implemented medallion architecture in Azure Databricks for PNC Bank’s CDP Layer, ensuring secure and efficient data processing, adhering to industry-standard security practices.</w:t>
+        <w:t>Implemented medallion architecture and Delta Lake tables in Azure Databricks for optimized data processing and storage.</w:t>
       </w:r>
     </w:p>
     <w:p>
@@ -429,7 +405,7 @@
         <w:rPr>
           <w:sz w:val="22"/>
         </w:rPr>
-        <w:t>Migrated legacy ETL workflows from Hadoop to Azure cloud, optimizing performance, scalability, and reducing operational costs by 30%, leveraging cloud-native tools for seamless migration.</w:t>
+        <w:t>Migrated legacy ETL workflows from Hadoop to Azure cloud, reducing costs and improving performance.</w:t>
       </w:r>
     </w:p>
     <w:p>
@@ -441,7 +417,7 @@
         <w:rPr>
           <w:sz w:val="22"/>
         </w:rPr>
-        <w:t>Built and managed Delta Lake tables, utilizing partitioning and Z-order optimization techniques for faster data processing and improved data accessibility, reducing query execution times.</w:t>
+        <w:t>Built and deployed data ingestion frameworks using Azure Data Factory, NiFi, and Python, ensuring seamless data integration from SQL Server, Oracle, and flat files into Azure Data Lake and Synapse.</w:t>
       </w:r>
     </w:p>
     <w:p>
@@ -453,7 +429,7 @@
         <w:rPr>
           <w:sz w:val="22"/>
         </w:rPr>
-        <w:t>Developed and deployed reusable data ingestion frameworks using Azure Data Factory, NiFi, and Python, integrating various data sources (including SQL Server, Oracle, and flat files) into Azure Data Lake and Synapse for centralized data storage.</w:t>
+        <w:t>Developed real-time streaming pipelines using Kafka and Azure Databricks for policy updates, feeding downstream systems such as Azure Cosmos DB and SQL.</w:t>
       </w:r>
     </w:p>
     <w:p>
@@ -465,7 +441,7 @@
         <w:rPr>
           <w:sz w:val="22"/>
         </w:rPr>
-        <w:t>Implemented real-time streaming pipelines using Kafka and Azure Databricks for policy updates, feeding downstream systems such as Azure Cosmos DB and SQL, enabling real-time data processing and analytics.</w:t>
+        <w:t>Integrated data quality frameworks in PySpark for schema validation, anomaly detection, and data integrity.</w:t>
       </w:r>
     </w:p>
     <w:p>
@@ -477,7 +453,7 @@
         <w:rPr>
           <w:sz w:val="22"/>
         </w:rPr>
-        <w:t>Integrated data quality frameworks in Azure Databricks using PySpark for schema validation, anomaly detection, and data integrity checks, ensuring data accuracy and consistency throughout the pipeline.</w:t>
+        <w:t>Automated CI/CD workflows with Azure DevOps for efficient pipeline deployment and updates.</w:t>
       </w:r>
     </w:p>
     <w:p>
@@ -489,19 +465,7 @@
         <w:rPr>
           <w:sz w:val="22"/>
         </w:rPr>
-        <w:t>Automated CI/CD workflows with Azure DevOps for seamless data pipeline deployment and smooth updates across environments, reducing deployment times and improving efficiency.</w:t>
-      </w:r>
-    </w:p>
-    <w:p>
-      <w:pPr>
-        <w:pStyle w:val="ListBullet"/>
-        <w:jc w:val="both"/>
-      </w:pPr>
-      <w:r>
-        <w:rPr>
-          <w:sz w:val="22"/>
-        </w:rPr>
-        <w:t>Optimized query performance using AWS Redshift, achieving up to 30% faster query execution, leveraging columnar storage and parallel processing for efficient data retrieval.</w:t>
+        <w:t>Utilized Azure Boards for Agile project management, ensuring timely delivery of data modernization and AI model readiness.</w:t>
       </w:r>
     </w:p>
     <w:p>
@@ -523,7 +487,7 @@
         <w:rPr>
           <w:b w:val="0"/>
         </w:rPr>
-        <w:t>Azure Databricks, Databricks Unity Catalog, ADF, Azure Data Lake Storage Gen2, Azure Synapse Analytics, Azure Blob Storage, Azure SQL, Azure Key Vault, Azure Functions, Azure DevOps, Azure Monitor, Azure Log Analytics, Azure RBAC, Microsoft Fabric, Apache Spark, PySpark, Delta Lake, Apache Kafka, Spark Structured Streaming, HDFS, Apache NiFi, SQL Server, SQL Server Management Studio(SSMS), Kubernetes, Row-Level Security, Column Masking, Encryption, LangChain, OpenAI APIs, Python</w:t>
+        <w:t>Azure Databricks, Databricks Unity Catalog, ADF, Azure Data Lake Storage Gen2, Azure Synapse Analytics, Azure Blob Storage, Azure SQL, Azure Key Vault, Azure Functions, Azure DevOps, Apache Spark, PySpark, Delta Lake, Apache Kafka, Spark Structured Streaming, HDFS, Apache NiFi, SQL Server, Kubernetes, LangChain, OpenAI APIs, Python</w:t>
       </w:r>
     </w:p>
     <w:tbl>
@@ -599,7 +563,7 @@
         <w:rPr>
           <w:sz w:val="22"/>
         </w:rPr>
-        <w:t>Designed and implemented scalable ETL pipelines using AWS Glue, Apache Spark (PySpark), and Python for financial and insurance data, enabling efficient data transformations for loan applications and insurance claims processing, adhering to GDPR compliance standards.</w:t>
+        <w:t>Designed and implemented scalable ETL pipelines using AWS Glue, Apache Spark (PySpark), and Python for financial and insurance data, enabling efficient loan application and claims processing.</w:t>
       </w:r>
     </w:p>
     <w:p>
@@ -611,7 +575,7 @@
         <w:rPr>
           <w:sz w:val="22"/>
         </w:rPr>
-        <w:t>Managed a secure data lake architecture on Amazon S3, integrated with AWS Lake Formation and AWS Macie for access control and data security, ensuring data privacy and confidentiality.</w:t>
+        <w:t>Managed a secure data lake architecture on Amazon S3, ensuring compliance with GDPR and utilizing AWS Lambda and Apache Kafka for real-time, serverless data processing.</w:t>
       </w:r>
     </w:p>
     <w:p>
@@ -623,7 +587,7 @@
         <w:rPr>
           <w:sz w:val="22"/>
         </w:rPr>
-        <w:t>Utilized AWS Lambda and Apache Kafka for serverless and real-time processing of insurance and loan data, optimizing performance and reducing latency.</w:t>
+        <w:t>Migrated legacy RDBMS data (Oracle) to AWS cloud services (S3, Redshift), optimizing Redshift for faster query performance.</w:t>
       </w:r>
     </w:p>
     <w:p>
@@ -635,7 +599,7 @@
         <w:rPr>
           <w:sz w:val="22"/>
         </w:rPr>
-        <w:t>Migrated legacy RDBMS data (Oracle) to AWS cloud services (S3 and Redshift) for centralized processing, improving query performance and reducing execution times by up to 30%, leveraging cloud-native features.</w:t>
+        <w:t>Developed REST APIs using Flask and Python to expose loan and insurance datasets, integrating Salesforce, ServiceNow, and SAP data into the AWS data lake for unified analytics and real-time insights.</w:t>
       </w:r>
     </w:p>
     <w:p>
@@ -647,7 +611,7 @@
         <w:rPr>
           <w:sz w:val="22"/>
         </w:rPr>
-        <w:t>Developed REST APIs using Flask and Python to expose loan and insurance datasets for internal applications, enabling seamless data integration and access.</w:t>
+        <w:t>Built scalable data ingestion workflows with AWS Athena for ad-hoc analytics on semi-structured data.</w:t>
       </w:r>
     </w:p>
     <w:p>
@@ -659,43 +623,7 @@
         <w:rPr>
           <w:sz w:val="22"/>
         </w:rPr>
-        <w:t>Integrated Salesforce, ServiceNow, and SAP data into the AWS data lake, providing unified customer analytics and real-time business insights, enhancing data-driven decision-making.</w:t>
-      </w:r>
-    </w:p>
-    <w:p>
-      <w:pPr>
-        <w:pStyle w:val="ListBullet"/>
-        <w:jc w:val="both"/>
-      </w:pPr>
-      <w:r>
-        <w:rPr>
-          <w:sz w:val="22"/>
-        </w:rPr>
-        <w:t>Performed NPV calculations and basic business financial modeling to support data-driven ROI decisions, ensuring cost-effective strategies.</w:t>
-      </w:r>
-    </w:p>
-    <w:p>
-      <w:pPr>
-        <w:pStyle w:val="ListBullet"/>
-        <w:jc w:val="both"/>
-      </w:pPr>
-      <w:r>
-        <w:rPr>
-          <w:sz w:val="22"/>
-        </w:rPr>
-        <w:t>Built scalable data ingestion workflows with AWS Athena for semi-structured data querying, enhancing ad-hoc analytics capabilities and data exploration.</w:t>
-      </w:r>
-    </w:p>
-    <w:p>
-      <w:pPr>
-        <w:pStyle w:val="ListBullet"/>
-        <w:jc w:val="both"/>
-      </w:pPr>
-      <w:r>
-        <w:rPr>
-          <w:sz w:val="22"/>
-        </w:rPr>
-        <w:t>Implemented CI/CD workflows with GitHub Actions for automated deployment and testing of ETL pipelines, ensuring efficient schema evolution, access governance, and version control.</w:t>
+        <w:t>Implemented CI/CD workflows with GitHub Actions for automated testing and deployment of ETL pipelines, utilizing AWS Glue Data Catalog for efficient schema management and access governance.</w:t>
       </w:r>
     </w:p>
     <w:p>
@@ -717,7 +645,7 @@
         <w:rPr>
           <w:b w:val="0"/>
         </w:rPr>
-        <w:t>AWS Glue, Amazon S3, AWS Lake Formation, AWS Lambda, Redshift, AWS Macie, AWS Step Functions, AWS Glue Data Catalog, DMS, CloudWatch, CloudFormation, AWS Sage Maker, Apache Spark, PySpark, Apache Kafka, Spark Streaming, Oracle, Python, Flask, Airflow, GitHub Actions, Salesforce Sales Cloud, SAP, ServiceNow, Redis, Power BI, Amazon Quicksight</w:t>
+        <w:t>AWS Glue, Amazon S3, AWS Lake Formation, AWS Lambda, Redshift, AWS Macie, AWS Step Functions, AWS Glue Data Catalog, DMS, CloudWatch, CloudFormation, AWS SageMaker, Apache Spark, PySpark, Apache Kafka, Spark Streaming, Oracle, Python, Flask, Airflow, GitHub Actions, Salesforce Sales Cloud, SAP, ServiceNow, Redis, Power BI, Amazon QuickSight</w:t>
       </w:r>
     </w:p>
     <w:tbl>
@@ -793,7 +721,7 @@
         <w:rPr>
           <w:sz w:val="22"/>
         </w:rPr>
-        <w:t>Architected a hybrid cloud platform using on-premise Hadoop (HDFS, Hive, Spark) and Azure services (Azure Data Lake Storage, Azure Synapse Analytics, Azure Data Factory, Azure Databricks) to process large-scale healthcare datasets, leveraging cloud scalability and on-premise data security.</w:t>
+        <w:t>Architected a hybrid cloud platform using on-premise Hadoop (HDFS, Hive, Spark) and Azure services for processing large-scale healthcare datasets.</w:t>
       </w:r>
     </w:p>
     <w:p>
@@ -805,7 +733,7 @@
         <w:rPr>
           <w:sz w:val="22"/>
         </w:rPr>
-        <w:t>Built secure, automated ETL pipelines using Azure Data Factory, integrating data from clinical systems, EHRs, and legacy databases into Azure SQL DB and Synapse for scalable analytics, ensuring data integrity and compliance.</w:t>
+        <w:t>Built secure, automated ETL pipelines with Azure Data Factory, integrating clinical, operational, and patient data from various sources into Azure SQL DB and Synapse for analytics.</w:t>
       </w:r>
     </w:p>
     <w:p>
@@ -817,7 +745,7 @@
         <w:rPr>
           <w:sz w:val="22"/>
         </w:rPr>
-        <w:t>Developed real-time streaming workflows using Apache Kafka, Azure Event Hubs, and Structured Streaming in Azure Databricks to process live clinical data and supply chain telemetry, enabling real-time insights and decision-making.</w:t>
+        <w:t>Developed real-time streaming workflows using Apache Kafka, Azure Event Hubs, and Structured Streaming in Azure Databricks for live clinical data processing.</w:t>
       </w:r>
     </w:p>
     <w:p>
@@ -829,7 +757,7 @@
         <w:rPr>
           <w:sz w:val="22"/>
         </w:rPr>
-        <w:t>Modeled healthcare-specific data marts with dbt, deployed on Synapse, providing business insights on adverse events, patient adherence, and treatment outcomes, supporting data-driven healthcare improvements.</w:t>
+        <w:t>Modeled healthcare-specific data marts with dbt, deployed on Synapse, providing insights on adverse events, patient adherence, and treatment outcomes.</w:t>
       </w:r>
     </w:p>
     <w:p>
@@ -841,7 +769,7 @@
         <w:rPr>
           <w:sz w:val="22"/>
         </w:rPr>
-        <w:t>Migrated on-prem systems (Oracle, Teradata, Hadoop) to Azure cloud using Azure Database Migration Service and Terraform, ensuring zero data loss, maintaining performance parity, and reducing on-premise infrastructure costs.</w:t>
+        <w:t>Migrated on-prem systems (Oracle, Teradata, Hadoop) to Azure cloud using Azure Database Migration Service and Terraform, ensuring data integrity and performance.</w:t>
       </w:r>
     </w:p>
     <w:p>
@@ -853,7 +781,7 @@
         <w:rPr>
           <w:sz w:val="22"/>
         </w:rPr>
-        <w:t>Implemented data governance and compliance controls using Azure Purview, Role-Based Access Control (RBAC), Key Vault, and data encryption for data protection, adhering to industry regulations.</w:t>
+        <w:t>Implemented data governance and compliance controls with Azure Purview, RBAC, Key Vault, and data encryption.</w:t>
       </w:r>
     </w:p>
     <w:p>
@@ -865,19 +793,7 @@
         <w:rPr>
           <w:sz w:val="22"/>
         </w:rPr>
-        <w:t>Automated deployment workflows via Azure DevOps, integrating PyTest for TDD, enabling consistent versioning, regression testing, and CI/CD for all data pipelines, improving development efficiency.</w:t>
-      </w:r>
-    </w:p>
-    <w:p>
-      <w:pPr>
-        <w:pStyle w:val="ListBullet"/>
-        <w:jc w:val="both"/>
-      </w:pPr>
-      <w:r>
-        <w:rPr>
-          <w:sz w:val="22"/>
-        </w:rPr>
-        <w:t>Utilized Snowflake and Redshift for data warehousing, optimizing data storage, processing, and query performance, leveraging columnar storage and distributed processing.</w:t>
+        <w:t>Automated deployment workflows via Azure DevOps, integrating PyTest for TDD and CI/CD.</w:t>
       </w:r>
     </w:p>
     <w:p>
@@ -920,10 +836,10 @@
           <w:b/>
           <w:color w:val="000000"/>
         </w:rPr>
-        <w:t xml:space="preserve">Master's Degree in Information Technology </w:t>
+        <w:t xml:space="preserve">Master's Degree </w:t>
       </w:r>
       <w:r>
-        <w:t>in Artificial Intelligence and Data Analytics | University of Wisconsin-Milwaukee</w:t>
+        <w:t>in Information Technology with a concentration in Artificial Intelligence and Data Analytics | University of Wisconsin-Milwaukee</w:t>
       </w:r>
     </w:p>
     <w:p>
@@ -1363,7 +1279,7 @@
       <w:spacing w:before="0" w:after="0" w:line="240" w:lineRule="auto"/>
     </w:pPr>
     <w:rPr>
-      <w:rFonts w:ascii="Calibri" w:hAnsi="Calibri"/>
+      <w:rFonts w:ascii="Helvetica" w:hAnsi="Helvetica"/>
       <w:sz w:val="22"/>
     </w:rPr>
   </w:style>

</xml_diff>

<commit_message>
font sizze in the header was changwed
</commit_message>
<xml_diff>
--- a/static/resumes/Yallaiah_Onteru.docx
+++ b/static/resumes/Yallaiah_Onteru.docx
@@ -59,7 +59,79 @@
         <w:rPr>
           <w:sz w:val="22"/>
         </w:rPr>
-        <w:t>Over 5.8 years of experience as a Data Engineer with expertise in Big Data technologies, Cloud Platforms (Azure, AWS), and data pipeline architecture. Skilled in designing scalable ETL/ELT workflows, real-time streaming pipelines, and data lakes. Proficient in Azure, AWS, and Hadoop ecosystems with a focus on insurance and finance sectors. Experience with ML model deployment and feature engineering. Agile project management and leadership skills.</w:t>
+        <w:t>Data Engineer with 6+ years of experience specializing in cloud data engineering and analytics across Azure, AWS, and GCP ecosystems.</w:t>
+      </w:r>
+    </w:p>
+    <w:p>
+      <w:pPr>
+        <w:pStyle w:val="ListBullet"/>
+        <w:jc w:val="both"/>
+      </w:pPr>
+      <w:r>
+        <w:rPr>
+          <w:sz w:val="22"/>
+        </w:rPr>
+        <w:t>Expertise in crafting scalable and efficient ETL/ELT pipelines, real-time streaming solutions, and data lake architectures to fuel AI models and business analytics.</w:t>
+      </w:r>
+    </w:p>
+    <w:p>
+      <w:pPr>
+        <w:pStyle w:val="ListBullet"/>
+        <w:jc w:val="both"/>
+      </w:pPr>
+      <w:r>
+        <w:rPr>
+          <w:sz w:val="22"/>
+        </w:rPr>
+        <w:t>Proficient in Azure Data Factory, Synapse Analytics, Databricks, AWS Glue, and PySpark for building robust and secure data processing systems.</w:t>
+      </w:r>
+    </w:p>
+    <w:p>
+      <w:pPr>
+        <w:pStyle w:val="ListBullet"/>
+        <w:jc w:val="both"/>
+      </w:pPr>
+      <w:r>
+        <w:rPr>
+          <w:sz w:val="22"/>
+        </w:rPr>
+        <w:t>Skilled in optimizing cloud database performance, reducing costs, and enhancing data quality with attention to detail, ensuring reliable insights for decision-making.</w:t>
+      </w:r>
+    </w:p>
+    <w:p>
+      <w:pPr>
+        <w:pStyle w:val="ListBullet"/>
+        <w:jc w:val="both"/>
+      </w:pPr>
+      <w:r>
+        <w:rPr>
+          <w:sz w:val="22"/>
+        </w:rPr>
+        <w:t>Hands-on experience with Hadoop, AWS Redshift, and Azure Synapse for large-scale data warehousing and advanced analytics.</w:t>
+      </w:r>
+    </w:p>
+    <w:p>
+      <w:pPr>
+        <w:pStyle w:val="ListBullet"/>
+        <w:jc w:val="both"/>
+      </w:pPr>
+      <w:r>
+        <w:rPr>
+          <w:sz w:val="22"/>
+        </w:rPr>
+        <w:t>Proven ability to lead data engineering initiatives, manage timelines, and collaborate effectively with Agile and DevOps methodologies.</w:t>
+      </w:r>
+    </w:p>
+    <w:p>
+      <w:pPr>
+        <w:pStyle w:val="ListBullet"/>
+        <w:jc w:val="both"/>
+      </w:pPr>
+      <w:r>
+        <w:rPr>
+          <w:sz w:val="22"/>
+        </w:rPr>
+        <w:t>Committed to continuous learning and certified in Azure and AWS data engineering, reflecting a passion for professional growth.</w:t>
       </w:r>
     </w:p>
     <w:p>
@@ -85,77 +157,14 @@
           <w:color w:val="000000"/>
           <w:sz w:val="22"/>
         </w:rPr>
-        <w:t xml:space="preserve">Big Data Tools: </w:t>
+        <w:t xml:space="preserve">Cloud Platforms &amp; Services: </w:t>
       </w:r>
       <w:r>
         <w:rPr>
           <w:b w:val="0"/>
           <w:sz w:val="22"/>
         </w:rPr>
-        <w:t>Apache Spark, Hadoop, HDFS, Hive, Pig, Kafka, Sqoop, Flume, MapReduce</w:t>
-      </w:r>
-    </w:p>
-    <w:p>
-      <w:pPr>
-        <w:pStyle w:val="ListBullet"/>
-        <w:jc w:val="both"/>
-      </w:pPr>
-      <w:r>
-        <w:rPr>
-          <w:b/>
-          <w:color w:val="000000"/>
-          <w:sz w:val="22"/>
-        </w:rPr>
-        <w:t xml:space="preserve">Programming Languages: </w:t>
-      </w:r>
-      <w:r>
-        <w:rPr>
-          <w:b w:val="0"/>
-          <w:sz w:val="22"/>
-        </w:rPr>
-        <w:t>Python, SQL, Scala, Java, R, Shell Scripting</w:t>
-      </w:r>
-    </w:p>
-    <w:p>
-      <w:pPr>
-        <w:pStyle w:val="ListBullet"/>
-        <w:jc w:val="both"/>
-      </w:pPr>
-      <w:r>
-        <w:rPr>
-          <w:b/>
-          <w:color w:val="000000"/>
-          <w:sz w:val="22"/>
-        </w:rPr>
-        <w:t xml:space="preserve">ETL &amp; Workflow Tools: </w:t>
-      </w:r>
-      <w:r>
-        <w:rPr>
-          <w:b w:val="0"/>
-          <w:sz w:val="22"/>
-        </w:rPr>
-        <w:t>Apache NiFi, Talend, Informatica, Airflow</w:t>
-      </w:r>
-    </w:p>
-    <w:p>
-      <w:pPr>
-        <w:pStyle w:val="ListBullet"/>
-        <w:jc w:val="both"/>
-      </w:pPr>
-      <w:r>
-        <w:rPr>
-          <w:b/>
-          <w:color w:val="000000"/>
-          <w:sz w:val="22"/>
-        </w:rPr>
-        <w:t xml:space="preserve">Cloud Platforms: </w:t>
-      </w:r>
-      <w:r>
-        <w:rPr>
-          <w:b w:val="0"/>
-          <w:sz w:val="22"/>
-        </w:rPr>
-        <w:t>AWS (S3, EMR, Glue, Lambda, Redshift, Neptune, SageMaker), Azure (ADF, ADLS, Synapse, Databricks, Azure Boards)</w:t>
+        <w:t>Azure, AWS, GCP, Azure Data Lake, Azure Data Factory (ADF), Synapse Analytics, Blob Storage, Event Hubs, Azure Functions, AWS Glue, S3 Bucket, EMR, Redshift, Data Lake, AWS Lambda, Kinesis, Azure Logic Apps, Azure Analysis Services, Azure Machine Learning, Microsoft Fabric</w:t>
       </w:r>
     </w:p>
     <w:p>
@@ -176,7 +185,7 @@
           <w:b w:val="0"/>
           <w:sz w:val="22"/>
         </w:rPr>
-        <w:t>Oracle, MySQL, PostgreSQL, NoSQL, MongoDB, Cassandra, Snowflake</w:t>
+        <w:t>Oracle, MySQL, SQL Server, PostgreSQL, HBase, Snowflake, Cassandra, MongoDB, Teradata, DynamoDB, NoSQL, Azure SQL DB, cloud database</w:t>
       </w:r>
     </w:p>
     <w:p>
@@ -190,14 +199,14 @@
           <w:color w:val="000000"/>
           <w:sz w:val="22"/>
         </w:rPr>
-        <w:t xml:space="preserve">Data Modeling &amp; Warehousing: </w:t>
+        <w:t xml:space="preserve">Programming &amp; Scripting Languages: </w:t>
       </w:r>
       <w:r>
         <w:rPr>
           <w:b w:val="0"/>
           <w:sz w:val="22"/>
         </w:rPr>
-        <w:t>Dimensional modeling, Star/Snowflake schema, Data Lakes, Data Marts</w:t>
+        <w:t>Java, Python, Scala, Shell Script (bash, shell), T-SQL</w:t>
       </w:r>
     </w:p>
     <w:p>
@@ -211,14 +220,14 @@
           <w:color w:val="000000"/>
           <w:sz w:val="22"/>
         </w:rPr>
-        <w:t xml:space="preserve">DevOps &amp; CI/CD: </w:t>
+        <w:t xml:space="preserve">DevOps &amp; Automation: </w:t>
       </w:r>
       <w:r>
         <w:rPr>
           <w:b w:val="0"/>
           <w:sz w:val="22"/>
         </w:rPr>
-        <w:t>Git, Jenkins, Docker, Terraform, CloudFormation</w:t>
+        <w:t>Azure DevOps, Jenkins, GitHub Actions, Terraform, Docker, Git, Kubernetes, Maven</w:t>
       </w:r>
     </w:p>
     <w:p>
@@ -232,14 +241,14 @@
           <w:color w:val="000000"/>
           <w:sz w:val="22"/>
         </w:rPr>
-        <w:t xml:space="preserve">Visualization Tools: </w:t>
+        <w:t xml:space="preserve">Big Data &amp; Distributed Systems: </w:t>
       </w:r>
       <w:r>
         <w:rPr>
           <w:b w:val="0"/>
           <w:sz w:val="22"/>
         </w:rPr>
-        <w:t>Power BI, Tableau, AWS QuickSight</w:t>
+        <w:t>HDFS, MapReduce, Pig, Hive, Sqoop, Impala, Zookeeper, Flume, Kafka, Yarn, Cloudera Manager, PySpark, Airflow, Spark Components, Apache Nifi, Apache Spark, Spark SQL</w:t>
       </w:r>
     </w:p>
     <w:p>
@@ -253,14 +262,14 @@
           <w:color w:val="000000"/>
           <w:sz w:val="22"/>
         </w:rPr>
-        <w:t xml:space="preserve">AI/ML &amp; GenAI: </w:t>
+        <w:t xml:space="preserve">Data Visualization &amp; BI: </w:t>
       </w:r>
       <w:r>
         <w:rPr>
           <w:b w:val="0"/>
           <w:sz w:val="22"/>
         </w:rPr>
-        <w:t>LLM, M-Llib, Scikit-learn, Pandas, NumPy, PyTorch, LangChain, RAG, GPT, Prompt Engineering</w:t>
+        <w:t>Power BI, Tableau</w:t>
       </w:r>
     </w:p>
     <w:p>
@@ -274,14 +283,14 @@
           <w:color w:val="000000"/>
           <w:sz w:val="22"/>
         </w:rPr>
-        <w:t xml:space="preserve">Others: </w:t>
+        <w:t xml:space="preserve">ML &amp; Data Science: </w:t>
       </w:r>
       <w:r>
         <w:rPr>
           <w:b w:val="0"/>
           <w:sz w:val="22"/>
         </w:rPr>
-        <w:t>Data Governance, Data Quality Frameworks, Agile, Jira, Confluence</w:t>
+        <w:t>Machine Learning, Statistical Modeling, LLM, M-Llib, TensorFlow, Computer Vision, Scikit-learn, pandas, NumPy, pytorch, LangChain, RAG, GPT, Prompt Engineering</w:t>
       </w:r>
     </w:p>
     <w:p>
@@ -317,7 +326,7 @@
                 <w:b/>
                 <w:color w:val="000000"/>
               </w:rPr>
-              <w:t>Role: Azure Data Engineer</w:t>
+              <w:t>Role: Senior Data Engineer</w:t>
             </w:r>
           </w:p>
           <w:p>
@@ -343,7 +352,7 @@
                 <w:b/>
                 <w:color w:val="000000"/>
               </w:rPr>
-              <w:t>April 2024 – Present</w:t>
+              <w:t>Apr 2024 - Present</w:t>
             </w:r>
           </w:p>
         </w:tc>
@@ -369,7 +378,7 @@
         <w:rPr>
           <w:sz w:val="22"/>
         </w:rPr>
-        <w:t>Designed and implemented enterprise-grade ETL pipelines with Azure Databricks and Apache Spark, processing 10TB of insurance policy data daily for underwriting and risk analysis.</w:t>
+        <w:t>Directed the design and development of a data mart on the CDP layer, integrating 22 AI models for automated report generation and enhanced real-time analytics.</w:t>
       </w:r>
     </w:p>
     <w:p>
@@ -381,7 +390,7 @@
         <w:rPr>
           <w:sz w:val="22"/>
         </w:rPr>
-        <w:t>Led the architecture and development of a Data Mart in the CDP Layer, integrating data from various sources and feeding 22 AI models for automated report generation and real-time analytics.</w:t>
+        <w:t>Engineered and optimized enterprise-level ETL pipelines using Azure Databricks, Apache Spark, and partitioning techniques to process 10TB of insurance policy data daily.</w:t>
       </w:r>
     </w:p>
     <w:p>
@@ -393,7 +402,7 @@
         <w:rPr>
           <w:sz w:val="22"/>
         </w:rPr>
-        <w:t>Implemented medallion architecture and Delta Lake tables in Azure Databricks for optimized data processing and storage.</w:t>
+        <w:t>Architected a Data Mart in the CDP layer, fueling AI models and streamlining data-driven insights for underwriting and risk analysis.</w:t>
       </w:r>
     </w:p>
     <w:p>
@@ -405,7 +414,7 @@
         <w:rPr>
           <w:sz w:val="22"/>
         </w:rPr>
-        <w:t>Migrated legacy ETL workflows from Hadoop to Azure cloud, reducing costs and improving performance.</w:t>
+        <w:t>Conducted exploratory data analysis (EDA) and medallion architecture design in Azure Databricks for robust data preparation and transformation.</w:t>
       </w:r>
     </w:p>
     <w:p>
@@ -417,7 +426,7 @@
         <w:rPr>
           <w:sz w:val="22"/>
         </w:rPr>
-        <w:t>Built and deployed data ingestion frameworks using Azure Data Factory, NiFi, and Python, ensuring seamless data integration from SQL Server, Oracle, and flat files into Azure Data Lake and Synapse.</w:t>
+        <w:t>Migrated legacy ETL/ELT workflows from Hadoop to Azure Cloud, reducing costs by 30% and improving performance.</w:t>
       </w:r>
     </w:p>
     <w:p>
@@ -429,7 +438,7 @@
         <w:rPr>
           <w:sz w:val="22"/>
         </w:rPr>
-        <w:t>Developed real-time streaming pipelines using Kafka and Azure Databricks for policy updates, feeding downstream systems such as Azure Cosmos DB and SQL.</w:t>
+        <w:t>Developed reusable data ingestion frameworks with Azure Data Factory, NiFi, and Python, integrating diverse data sources into Azure Data Lake and Synapse Analytics.</w:t>
       </w:r>
     </w:p>
     <w:p>
@@ -441,7 +450,7 @@
         <w:rPr>
           <w:sz w:val="22"/>
         </w:rPr>
-        <w:t>Integrated data quality frameworks in PySpark for schema validation, anomaly detection, and data integrity.</w:t>
+        <w:t>Implemented real-time streaming pipelines using Kafka, Azure Databricks, and Azure Cosmos DB for policy updates and downstream systems.</w:t>
       </w:r>
     </w:p>
     <w:p>
@@ -453,7 +462,7 @@
         <w:rPr>
           <w:sz w:val="22"/>
         </w:rPr>
-        <w:t>Automated CI/CD workflows with Azure DevOps for efficient pipeline deployment and updates.</w:t>
+        <w:t>Established data quality frameworks with PySpark in Azure Databricks for schema validation, anomaly detection, and data integrity.</w:t>
       </w:r>
     </w:p>
     <w:p>
@@ -465,7 +474,43 @@
         <w:rPr>
           <w:sz w:val="22"/>
         </w:rPr>
-        <w:t>Utilized Azure Boards for Agile project management, ensuring timely delivery of data modernization and AI model readiness.</w:t>
+        <w:t>Configured Change Data Capture (CDC) and automated incremental data loads, ensuring seamless source change monitoring.</w:t>
+      </w:r>
+    </w:p>
+    <w:p>
+      <w:pPr>
+        <w:pStyle w:val="ListBullet"/>
+        <w:jc w:val="both"/>
+      </w:pPr>
+      <w:r>
+        <w:rPr>
+          <w:sz w:val="22"/>
+        </w:rPr>
+        <w:t>Automated CI/CD workflows with Azure DevOps for efficient pipeline deployment and continuous integration.</w:t>
+      </w:r>
+    </w:p>
+    <w:p>
+      <w:pPr>
+        <w:pStyle w:val="ListBullet"/>
+        <w:jc w:val="both"/>
+      </w:pPr>
+      <w:r>
+        <w:rPr>
+          <w:sz w:val="22"/>
+        </w:rPr>
+        <w:t>Applied data normalization and ACID-compliant Delta Lake storage, reducing downstream errors and enhancing ETL reliability.</w:t>
+      </w:r>
+    </w:p>
+    <w:p>
+      <w:pPr>
+        <w:pStyle w:val="ListBullet"/>
+        <w:jc w:val="both"/>
+      </w:pPr>
+      <w:r>
+        <w:rPr>
+          <w:sz w:val="22"/>
+        </w:rPr>
+        <w:t>Utilized Agile methodologies via Azure Boards to manage project timelines and deliver timely data modernization initiatives.</w:t>
       </w:r>
     </w:p>
     <w:p>
@@ -487,7 +532,7 @@
         <w:rPr>
           <w:b w:val="0"/>
         </w:rPr>
-        <w:t>Azure Databricks, Databricks Unity Catalog, ADF, Azure Data Lake Storage Gen2, Azure Synapse Analytics, Azure Blob Storage, Azure SQL, Azure Key Vault, Azure Functions, Azure DevOps, Apache Spark, PySpark, Delta Lake, Apache Kafka, Spark Structured Streaming, HDFS, Apache NiFi, SQL Server, Kubernetes, LangChain, OpenAI APIs, Python</w:t>
+        <w:t>Azure, Azure Databricks, Apache Spark, Azure Data Factory, NiFi, Python, Azure Data Lake, Synapse Analytics, Kafka, Azure Cosmos DB, PySpark, Azure DevOps, Azure Boards</w:t>
       </w:r>
     </w:p>
     <w:tbl>
@@ -537,7 +582,7 @@
                 <w:b/>
                 <w:color w:val="000000"/>
               </w:rPr>
-              <w:t>Dec 2020 – Sept 2023</w:t>
+              <w:t>Dec 2020 - Sep 2023</w:t>
             </w:r>
           </w:p>
         </w:tc>
@@ -563,7 +608,7 @@
         <w:rPr>
           <w:sz w:val="22"/>
         </w:rPr>
-        <w:t>Designed and implemented scalable ETL pipelines using AWS Glue, Apache Spark (PySpark), and Python for financial and insurance data, enabling efficient loan application and claims processing.</w:t>
+        <w:t>Streamlined data processing and analytics using AWS Glue, Apache Spark, and Python, driving efficient ETL pipelines and secure data lake implementations on Amazon S3.</w:t>
       </w:r>
     </w:p>
     <w:p>
@@ -575,7 +620,7 @@
         <w:rPr>
           <w:sz w:val="22"/>
         </w:rPr>
-        <w:t>Managed a secure data lake architecture on Amazon S3, ensuring compliance with GDPR and utilizing AWS Lambda and Apache Kafka for real-time, serverless data processing.</w:t>
+        <w:t>Constructed production-grade ETL pipelines with AWS Glue and PySpark, featuring advanced error handling and L3 support, processing over 2TB of transactional data.</w:t>
       </w:r>
     </w:p>
     <w:p>
@@ -587,7 +632,7 @@
         <w:rPr>
           <w:sz w:val="22"/>
         </w:rPr>
-        <w:t>Migrated legacy RDBMS data (Oracle) to AWS cloud services (S3, Redshift), optimizing Redshift for faster query performance.</w:t>
+        <w:t>Managed a secure data lake architecture with AWS Lake Formation, AWS Macie, and real-time processing via AWS Lambda and Apache Kafka for insurance and loan data.</w:t>
       </w:r>
     </w:p>
     <w:p>
@@ -599,7 +644,7 @@
         <w:rPr>
           <w:sz w:val="22"/>
         </w:rPr>
-        <w:t>Developed REST APIs using Flask and Python to expose loan and insurance datasets, integrating Salesforce, ServiceNow, and SAP data into the AWS data lake for unified analytics and real-time insights.</w:t>
+        <w:t>Migrated legacy Oracle RDBMS data to AWS cloud services (S3, Redshift), optimizing query performance with advanced Redshift techniques for faster execution.</w:t>
       </w:r>
     </w:p>
     <w:p>
@@ -611,7 +656,7 @@
         <w:rPr>
           <w:sz w:val="22"/>
         </w:rPr>
-        <w:t>Built scalable data ingestion workflows with AWS Athena for ad-hoc analytics on semi-structured data.</w:t>
+        <w:t>Engineered scalable data ingestion workflows by integrating AWS Athena for semi-structured data querying, enhancing ad-hoc analytics capabilities.</w:t>
       </w:r>
     </w:p>
     <w:p>
@@ -623,7 +668,55 @@
         <w:rPr>
           <w:sz w:val="22"/>
         </w:rPr>
-        <w:t>Implemented CI/CD workflows with GitHub Actions for automated testing and deployment of ETL pipelines, utilizing AWS Glue Data Catalog for efficient schema management and access governance.</w:t>
+        <w:t>Designed incremental data flows using CDC and Databricks for near real-time ingestion of policy updates, improving latency-sensitive reporting systems.</w:t>
+      </w:r>
+    </w:p>
+    <w:p>
+      <w:pPr>
+        <w:pStyle w:val="ListBullet"/>
+        <w:jc w:val="both"/>
+      </w:pPr>
+      <w:r>
+        <w:rPr>
+          <w:sz w:val="22"/>
+        </w:rPr>
+        <w:t>Developed and maintained stored procedures in SQL Server and Redshift to automate transformation logic and ensure consistency across ETL jobs.</w:t>
+      </w:r>
+    </w:p>
+    <w:p>
+      <w:pPr>
+        <w:pStyle w:val="ListBullet"/>
+        <w:jc w:val="both"/>
+      </w:pPr>
+      <w:r>
+        <w:rPr>
+          <w:sz w:val="22"/>
+        </w:rPr>
+        <w:t>Orchestrated AWS Step Functions for automated multi-stage Glue ETL jobs and Lambda data validation, reducing manual effort in insurance claim processing.</w:t>
+      </w:r>
+    </w:p>
+    <w:p>
+      <w:pPr>
+        <w:pStyle w:val="ListBullet"/>
+        <w:jc w:val="both"/>
+      </w:pPr>
+      <w:r>
+        <w:rPr>
+          <w:sz w:val="22"/>
+        </w:rPr>
+        <w:t>Adopted Medallion Architecture best practices within AWS-integrated Databricks pipelines, enhancing data quality assurance and modular transformations.</w:t>
+      </w:r>
+    </w:p>
+    <w:p>
+      <w:pPr>
+        <w:pStyle w:val="ListBullet"/>
+        <w:jc w:val="both"/>
+      </w:pPr>
+      <w:r>
+        <w:rPr>
+          <w:sz w:val="22"/>
+        </w:rPr>
+        <w:t>Streamlined ETL pipeline deployment and testing by implementing Agile and DevOps practices with GitHub Actions and AWS Glue Data Catalog management.</w:t>
       </w:r>
     </w:p>
     <w:p>
@@ -645,7 +738,7 @@
         <w:rPr>
           <w:b w:val="0"/>
         </w:rPr>
-        <w:t>AWS Glue, Amazon S3, AWS Lake Formation, AWS Lambda, Redshift, AWS Macie, AWS Step Functions, AWS Glue Data Catalog, DMS, CloudWatch, CloudFormation, AWS SageMaker, Apache Spark, PySpark, Apache Kafka, Spark Streaming, Oracle, Python, Flask, Airflow, GitHub Actions, Salesforce Sales Cloud, SAP, ServiceNow, Redis, Power BI, Amazon QuickSight</w:t>
+        <w:t>AWS, AWS Glue, PySpark, Amazon S3, AWS Lake Formation, AWS Macie, AWS Lambda, Apache Kafka, Oracle, AWS Redshift, AWS Athena, CDC, Databricks, SQL Server, AWS Step Functions, GitHub Actions, AWS Glue Data Catalog</w:t>
       </w:r>
     </w:p>
     <w:tbl>
@@ -678,7 +771,7 @@
                 <w:b/>
                 <w:color w:val="000000"/>
               </w:rPr>
-              <w:t>Client: Cipla pharmaceuticals – Bengaluru, India</w:t>
+              <w:t>Client: Cipla pharmaceuticals</w:t>
             </w:r>
           </w:p>
         </w:tc>
@@ -695,7 +788,7 @@
                 <w:b/>
                 <w:color w:val="000000"/>
               </w:rPr>
-              <w:t>Jan 2019 – Dec 2020</w:t>
+              <w:t>Jan 2020 - Dec 2020</w:t>
             </w:r>
           </w:p>
         </w:tc>
@@ -721,7 +814,7 @@
         <w:rPr>
           <w:sz w:val="22"/>
         </w:rPr>
-        <w:t>Architected a hybrid cloud platform using on-premise Hadoop (HDFS, Hive, Spark) and Azure services for processing large-scale healthcare datasets.</w:t>
+        <w:t>Modernized Cipla's healthcare data infrastructure by integrating clinical, operational, and patient data into a hybrid cloud platform, enabling real-time insights for drug development and regulatory compliance.</w:t>
       </w:r>
     </w:p>
     <w:p>
@@ -733,7 +826,7 @@
         <w:rPr>
           <w:sz w:val="22"/>
         </w:rPr>
-        <w:t>Built secure, automated ETL pipelines with Azure Data Factory, integrating clinical, operational, and patient data from various sources into Azure SQL DB and Synapse for analytics.</w:t>
+        <w:t>Engineered a hybrid cloud platform leveraging Hadoop (HDFS, Hive, Spark) and Azure services (Azure Data Lake Storage, Synapse Analytics, Azure Data Factory, Azure Databricks) for large-scale healthcare data processing.</w:t>
       </w:r>
     </w:p>
     <w:p>
@@ -745,7 +838,7 @@
         <w:rPr>
           <w:sz w:val="22"/>
         </w:rPr>
-        <w:t>Developed real-time streaming workflows using Apache Kafka, Azure Event Hubs, and Structured Streaming in Azure Databricks for live clinical data processing.</w:t>
+        <w:t>Constructed secure and automated ETL pipelines with Azure Data Factory, integrating data from clinical systems, EHRs, and legacy databases into Azure SQL DB and Synapse for scalable analytics.</w:t>
       </w:r>
     </w:p>
     <w:p>
@@ -757,7 +850,7 @@
         <w:rPr>
           <w:sz w:val="22"/>
         </w:rPr>
-        <w:t>Modeled healthcare-specific data marts with dbt, deployed on Synapse, providing insights on adverse events, patient adherence, and treatment outcomes.</w:t>
+        <w:t>Developed HIPAA-compliant data pipelines for pharmaceutical clinical trials, servicing 10M+ patient records with stringent data governance standards.</w:t>
       </w:r>
     </w:p>
     <w:p>
@@ -769,7 +862,7 @@
         <w:rPr>
           <w:sz w:val="22"/>
         </w:rPr>
-        <w:t>Migrated on-prem systems (Oracle, Teradata, Hadoop) to Azure cloud using Azure Database Migration Service and Terraform, ensuring data integrity and performance.</w:t>
+        <w:t>Implemented real-time streaming workflows using Apache Kafka, Azure Event Hubs, and Structured Streaming in Azure Databricks for live clinical data handling and supply chain telemetry.</w:t>
       </w:r>
     </w:p>
     <w:p>
@@ -781,7 +874,7 @@
         <w:rPr>
           <w:sz w:val="22"/>
         </w:rPr>
-        <w:t>Implemented data governance and compliance controls with Azure Purview, RBAC, Key Vault, and data encryption.</w:t>
+        <w:t>Modeled healthcare-specific data marts with dbt on Synapse, providing insights on adverse events, patient adherence, and treatment outcomes.</w:t>
       </w:r>
     </w:p>
     <w:p>
@@ -793,7 +886,43 @@
         <w:rPr>
           <w:sz w:val="22"/>
         </w:rPr>
-        <w:t>Automated deployment workflows via Azure DevOps, integrating PyTest for TDD and CI/CD.</w:t>
+        <w:t>Maintained reliable data replication from SaaS platforms to Snowflake using Fivetran and Matillion.</w:t>
+      </w:r>
+    </w:p>
+    <w:p>
+      <w:pPr>
+        <w:pStyle w:val="ListBullet"/>
+        <w:jc w:val="both"/>
+      </w:pPr>
+      <w:r>
+        <w:rPr>
+          <w:sz w:val="22"/>
+        </w:rPr>
+        <w:t>Designed interactive dashboards in Power BI leveraging DAX, Power Query, and Power BI Service for efficient visualization and scheduled reporting.</w:t>
+      </w:r>
+    </w:p>
+    <w:p>
+      <w:pPr>
+        <w:pStyle w:val="ListBullet"/>
+        <w:jc w:val="both"/>
+      </w:pPr>
+      <w:r>
+        <w:rPr>
+          <w:sz w:val="22"/>
+        </w:rPr>
+        <w:t>Instituted data governance and compliance measures with Azure Purview, RBAC, Key Vault, and data encryption, ensuring data security.</w:t>
+      </w:r>
+    </w:p>
+    <w:p>
+      <w:pPr>
+        <w:pStyle w:val="ListBullet"/>
+        <w:jc w:val="both"/>
+      </w:pPr>
+      <w:r>
+        <w:rPr>
+          <w:sz w:val="22"/>
+        </w:rPr>
+        <w:t>Applied Infrastructure as Code (IaC) principles with Terraform to automate and version-control cloud resource provisioning.</w:t>
       </w:r>
     </w:p>
     <w:p>
@@ -815,7 +944,7 @@
         <w:rPr>
           <w:b w:val="0"/>
         </w:rPr>
-        <w:t>Azure Data Factory, Azure Synapse Analytics, Snowflake, Databricks, Delta Lake, Apache Spark, PySpark, Scala, SQL, Apache Kafka, Azure Event Hubs, Azure Stream Analytics, Power BI, Azure Cosmos DB, ADLS Gen2, HDFS, Hive, Pig, HBase, MapReduce, Sqoop, Flume, Zookeeper, Azure DevOps, Terraform, GitHub, Azure Monitor, Log Analytics, KQL, Azure Purview, Databricks Unity Catalog, RBAC, YAML, Azure Repos, Jira, Scrum, Agile</w:t>
+        <w:t>Azure, Hadoop, HDFS, Hive, Spark, Azure Data Lake Storage (Gen2), Azure Synapse Analytics, Azure Data Factory, Azure Databricks, Apache Kafka, Azure Event Hubs, Structured Streaming, Azure SQL DB, HIPAA, dbt, Snowflake, Fivetran, Matillion, Power BI, DAX, Power Query, Azure Purview, RBAC, Key Vault, Terraform</w:t>
       </w:r>
     </w:p>
     <w:p>
@@ -863,7 +992,7 @@
         <w:rPr>
           <w:sz w:val="22"/>
         </w:rPr>
-        <w:t>Azure Data Engineer –DP203</w:t>
+        <w:t>Azure Certified Data Engineer</w:t>
       </w:r>
     </w:p>
     <w:p>
@@ -875,7 +1004,7 @@
         <w:rPr>
           <w:sz w:val="22"/>
         </w:rPr>
-        <w:t>Azure AI Engineer-AI101</w:t>
+        <w:t>Azure Certified Engineer</w:t>
       </w:r>
     </w:p>
     <w:p>
@@ -887,7 +1016,7 @@
         <w:rPr>
           <w:sz w:val="22"/>
         </w:rPr>
-        <w:t>AWS Data Engineer Associate</w:t>
+        <w:t>AWS Certified Data Engineer</w:t>
       </w:r>
     </w:p>
     <w:p>
@@ -899,7 +1028,7 @@
         <w:rPr>
           <w:sz w:val="22"/>
         </w:rPr>
-        <w:t>Salesforce Developer-Associate</w:t>
+        <w:t>Certified Salesforce Developer</w:t>
       </w:r>
     </w:p>
     <w:sectPr>
@@ -1279,7 +1408,7 @@
       <w:spacing w:before="0" w:after="0" w:line="240" w:lineRule="auto"/>
     </w:pPr>
     <w:rPr>
-      <w:rFonts w:ascii="Helvetica" w:hAnsi="Helvetica"/>
+      <w:rFonts w:ascii="Calibri" w:hAnsi="Calibri"/>
       <w:sz w:val="22"/>
     </w:rPr>
   </w:style>

</xml_diff>

<commit_message>
the horizontal line is adding to word file
</commit_message>
<xml_diff>
--- a/static/resumes/Yallaiah_Onteru.docx
+++ b/static/resumes/Yallaiah_Onteru.docx
@@ -33,21 +33,57 @@
       <w:r>
         <w:rPr>
           <w:b w:val="0"/>
-          <w:sz w:val="20"/>
+          <w:sz w:val="24"/>
         </w:rPr>
-        <w:t>onteruyallaiah414@gmail.com | +1(414)-275-0857 | LinkedIn</w:t>
+        <w:t>onteruyallaiah414@gmail.com | +1(414)-275-0857 | LinkedIn | Portfolio</w:t>
       </w:r>
     </w:p>
+    <w:tbl>
+      <w:tblPr>
+        <w:tblStyle w:val="TableGrid"/>
+        <w:tblW w:type="auto" w:w="0"/>
+        <w:tblLayout w:type="fixed"/>
+        <w:tblLook w:firstColumn="1" w:firstRow="1" w:lastColumn="0" w:lastRow="0" w:noHBand="0" w:noVBand="1" w:val="04A0"/>
+      </w:tblPr>
+      <w:tblGrid>
+        <w:gridCol w:w="9000"/>
+      </w:tblGrid>
+      <w:tr>
+        <w:tc>
+          <w:tcPr>
+            <w:tcW w:type="dxa" w:w="10800"/>
+            <w:tcBorders>
+              <w:top w:val="nil"/>
+              <w:left w:val="nil"/>
+              <w:right w:val="nil"/>
+              <w:bottom w:val="single" w:sz="6" w:space="0" w:color="000000"/>
+            </w:tcBorders>
+          </w:tcPr>
+          <w:p>
+            <w:pPr>
+              <w:spacing w:after="120"/>
+            </w:pPr>
+            <w:r>
+              <w:rPr>
+                <w:b/>
+                <w:sz w:val="24"/>
+              </w:rPr>
+              <w:t>Professional Summary</w:t>
+            </w:r>
+          </w:p>
+        </w:tc>
+      </w:tr>
+    </w:tbl>
     <w:p>
       <w:pPr>
-        <w:spacing w:before="120"/>
+        <w:pStyle w:val="ListBullet"/>
+        <w:jc w:val="both"/>
       </w:pPr>
       <w:r>
         <w:rPr>
-          <w:b/>
-          <w:sz w:val="24"/>
+          <w:sz w:val="22"/>
         </w:rPr>
-        <w:t>Professional Summary</w:t>
+        <w:t>5.8+ years of experience as a Data Engineer with a focus on Big Data, Cloud (Azure &amp; AWS), and data pipeline architecture, specializing in the insurance and finance sectors.</w:t>
       </w:r>
     </w:p>
     <w:p>
@@ -59,7 +95,7 @@
         <w:rPr>
           <w:sz w:val="22"/>
         </w:rPr>
-        <w:t>Data Engineer with 6+ years of experience specializing in cloud data engineering and analytics across Azure, AWS, and GCP ecosystems.</w:t>
+        <w:t>Expert in designing scalable ETL/ELT workflows and real-time streaming pipelines using Apache Spark, ADF, NiFi, Kafka, Kinesis, and Airflow.</w:t>
       </w:r>
     </w:p>
     <w:p>
@@ -71,7 +107,7 @@
         <w:rPr>
           <w:sz w:val="22"/>
         </w:rPr>
-        <w:t>Expertise in crafting scalable and efficient ETL/ELT pipelines, real-time streaming solutions, and data lake architectures to fuel AI models and business analytics.</w:t>
+        <w:t>Proficient in Azure services: Data Factory, ADLS, Synapse Analytics, Azure SQL DB, Cosmos DB, HDInsight, Key Vault, and Azure DevOps.</w:t>
       </w:r>
     </w:p>
     <w:p>
@@ -83,7 +119,7 @@
         <w:rPr>
           <w:sz w:val="22"/>
         </w:rPr>
-        <w:t>Proficient in Azure Data Factory, Synapse Analytics, Databricks, AWS Glue, and PySpark for building robust and secure data processing systems.</w:t>
+        <w:t>Hands-on experience with AWS data engineering services: EC2, IAM, RDS, Redshift, Glue, EMR, Kinesis, Athena, Lambda, CloudWatch, and QuickSight.</w:t>
       </w:r>
     </w:p>
     <w:p>
@@ -95,7 +131,7 @@
         <w:rPr>
           <w:sz w:val="22"/>
         </w:rPr>
-        <w:t>Skilled in optimizing cloud database performance, reducing costs, and enhancing data quality with attention to detail, ensuring reliable insights for decision-making.</w:t>
+        <w:t>Extensive knowledge of the Hadoop ecosystem: HDFS, Hive, Pig, MapReduce, HBase, Impala, Sqoop, Flume, and data ingestion from various formats (JSON, CSV, AVRO, Parquet).</w:t>
       </w:r>
     </w:p>
     <w:p>
@@ -107,7 +143,7 @@
         <w:rPr>
           <w:sz w:val="22"/>
         </w:rPr>
-        <w:t>Hands-on experience with Hadoop, AWS Redshift, and Azure Synapse for large-scale data warehousing and advanced analytics.</w:t>
+        <w:t>Designed data lakes and data warehouses using Snowflake, Redshift, and Azure Synapse, integrating Snowpipe and Lake Formation for efficient data processing.</w:t>
       </w:r>
     </w:p>
     <w:p>
@@ -119,7 +155,7 @@
         <w:rPr>
           <w:sz w:val="22"/>
         </w:rPr>
-        <w:t>Proven ability to lead data engineering initiatives, manage timelines, and collaborate effectively with Agile and DevOps methodologies.</w:t>
+        <w:t>Implemented DataOps practices with CI/CD pipelines using Terraform, Jenkins, GitHub Actions, and Azure DevOps, reducing release cycle times.</w:t>
       </w:r>
     </w:p>
     <w:p>
@@ -131,19 +167,88 @@
         <w:rPr>
           <w:sz w:val="22"/>
         </w:rPr>
-        <w:t>Committed to continuous learning and certified in Azure and AWS data engineering, reflecting a passion for professional growth.</w:t>
+        <w:t>Applied data governance and quality frameworks to ensure schema validation, referential integrity, and compliance with HIPAA, CCPA, SOC 2, and GDPR.</w:t>
       </w:r>
     </w:p>
     <w:p>
       <w:pPr>
-        <w:spacing w:before="120"/>
+        <w:pStyle w:val="ListBullet"/>
+        <w:jc w:val="both"/>
+      </w:pPr>
+      <w:r>
+        <w:rPr>
+          <w:sz w:val="22"/>
+        </w:rPr>
+        <w:t>Built interactive BI dashboards with Power BI, Tableau, and Plotly for business insights and KPI tracking.</w:t>
+      </w:r>
+    </w:p>
+    <w:p>
+      <w:pPr>
+        <w:pStyle w:val="ListBullet"/>
+        <w:jc w:val="both"/>
+      </w:pPr>
+      <w:r>
+        <w:rPr>
+          <w:sz w:val="22"/>
+        </w:rPr>
+        <w:t>Collaborated with cross-functional teams to support ML model deployment, feature engineering, and system interoperability with RESTful APIs.</w:t>
+      </w:r>
+    </w:p>
+    <w:tbl>
+      <w:tblPr>
+        <w:tblStyle w:val="TableGrid"/>
+        <w:tblW w:type="auto" w:w="0"/>
+        <w:tblLayout w:type="fixed"/>
+        <w:tblLook w:firstColumn="1" w:firstRow="1" w:lastColumn="0" w:lastRow="0" w:noHBand="0" w:noVBand="1" w:val="04A0"/>
+      </w:tblPr>
+      <w:tblGrid>
+        <w:gridCol w:w="9000"/>
+      </w:tblGrid>
+      <w:tr>
+        <w:tc>
+          <w:tcPr>
+            <w:tcW w:type="dxa" w:w="10800"/>
+            <w:tcBorders>
+              <w:top w:val="nil"/>
+              <w:left w:val="nil"/>
+              <w:right w:val="nil"/>
+              <w:bottom w:val="single" w:sz="6" w:space="0" w:color="000000"/>
+            </w:tcBorders>
+          </w:tcPr>
+          <w:p>
+            <w:pPr>
+              <w:spacing w:after="120"/>
+            </w:pPr>
+            <w:r>
+              <w:rPr>
+                <w:b/>
+                <w:sz w:val="24"/>
+              </w:rPr>
+              <w:t>Technical Skills</w:t>
+            </w:r>
+          </w:p>
+        </w:tc>
+      </w:tr>
+    </w:tbl>
+    <w:p>
+      <w:pPr>
+        <w:pStyle w:val="ListBullet"/>
+        <w:jc w:val="both"/>
       </w:pPr>
       <w:r>
         <w:rPr>
           <w:b/>
-          <w:sz w:val="24"/>
+          <w:color w:val="000000"/>
+          <w:sz w:val="22"/>
         </w:rPr>
-        <w:t>Technical Skills</w:t>
+        <w:t xml:space="preserve">Big Data Tools: </w:t>
+      </w:r>
+      <w:r>
+        <w:rPr>
+          <w:b w:val="0"/>
+          <w:sz w:val="22"/>
+        </w:rPr>
+        <w:t>Apache Spark, Hadoop, HDFS, Hive, Pig, Kafka, Sqoop, Flume, MapReduce</w:t>
       </w:r>
     </w:p>
     <w:p>
@@ -157,14 +262,56 @@
           <w:color w:val="000000"/>
           <w:sz w:val="22"/>
         </w:rPr>
-        <w:t xml:space="preserve">Cloud Platforms &amp; Services: </w:t>
+        <w:t xml:space="preserve">Programming Languages: </w:t>
       </w:r>
       <w:r>
         <w:rPr>
           <w:b w:val="0"/>
           <w:sz w:val="22"/>
         </w:rPr>
-        <w:t>Azure, AWS, GCP, Azure Data Lake, Azure Data Factory (ADF), Synapse Analytics, Blob Storage, Event Hubs, Azure Functions, AWS Glue, S3 Bucket, EMR, Redshift, Data Lake, AWS Lambda, Kinesis, Azure Logic Apps, Azure Analysis Services, Azure Machine Learning, Microsoft Fabric</w:t>
+        <w:t>Python, SQL, Scala, Java, R, Shell Scripting</w:t>
+      </w:r>
+    </w:p>
+    <w:p>
+      <w:pPr>
+        <w:pStyle w:val="ListBullet"/>
+        <w:jc w:val="both"/>
+      </w:pPr>
+      <w:r>
+        <w:rPr>
+          <w:b/>
+          <w:color w:val="000000"/>
+          <w:sz w:val="22"/>
+        </w:rPr>
+        <w:t xml:space="preserve">ETL &amp; Workflow Tools: </w:t>
+      </w:r>
+      <w:r>
+        <w:rPr>
+          <w:b w:val="0"/>
+          <w:sz w:val="22"/>
+        </w:rPr>
+        <w:t>Apache NiFi, Talend, Informatica, Airflow</w:t>
+      </w:r>
+    </w:p>
+    <w:p>
+      <w:pPr>
+        <w:pStyle w:val="ListBullet"/>
+        <w:jc w:val="both"/>
+      </w:pPr>
+      <w:r>
+        <w:rPr>
+          <w:b/>
+          <w:color w:val="000000"/>
+          <w:sz w:val="22"/>
+        </w:rPr>
+        <w:t xml:space="preserve">Cloud Platforms: </w:t>
+      </w:r>
+      <w:r>
+        <w:rPr>
+          <w:b w:val="0"/>
+          <w:sz w:val="22"/>
+        </w:rPr>
+        <w:t>AWS (S3, EMR, Glue, Lambda, Redshift), Azure (ADF, ADLS, Synapse, Databricks)</w:t>
       </w:r>
     </w:p>
     <w:p>
@@ -185,7 +332,7 @@
           <w:b w:val="0"/>
           <w:sz w:val="22"/>
         </w:rPr>
-        <w:t>Oracle, MySQL, SQL Server, PostgreSQL, HBase, Snowflake, Cassandra, MongoDB, Teradata, DynamoDB, NoSQL, Azure SQL DB, cloud database</w:t>
+        <w:t>Oracle, MySQL, PostgreSQL, NoSQL, MongoDB, Cassandra, Snowflake</w:t>
       </w:r>
     </w:p>
     <w:p>
@@ -199,14 +346,14 @@
           <w:color w:val="000000"/>
           <w:sz w:val="22"/>
         </w:rPr>
-        <w:t xml:space="preserve">Programming &amp; Scripting Languages: </w:t>
+        <w:t xml:space="preserve">Data Modeling &amp; Warehousing: </w:t>
       </w:r>
       <w:r>
         <w:rPr>
           <w:b w:val="0"/>
           <w:sz w:val="22"/>
         </w:rPr>
-        <w:t>Java, Python, Scala, Shell Script (bash, shell), T-SQL</w:t>
+        <w:t>Dimensional modeling, Star/Snowflake schema, Data Lakes, Data Marts</w:t>
       </w:r>
     </w:p>
     <w:p>
@@ -220,14 +367,14 @@
           <w:color w:val="000000"/>
           <w:sz w:val="22"/>
         </w:rPr>
-        <w:t xml:space="preserve">DevOps &amp; Automation: </w:t>
+        <w:t xml:space="preserve">DevOps &amp; CI/CD: </w:t>
       </w:r>
       <w:r>
         <w:rPr>
           <w:b w:val="0"/>
           <w:sz w:val="22"/>
         </w:rPr>
-        <w:t>Azure DevOps, Jenkins, GitHub Actions, Terraform, Docker, Git, Kubernetes, Maven</w:t>
+        <w:t>Git, Jenkins, Docker, Terraform, CloudFormation</w:t>
       </w:r>
     </w:p>
     <w:p>
@@ -241,14 +388,14 @@
           <w:color w:val="000000"/>
           <w:sz w:val="22"/>
         </w:rPr>
-        <w:t xml:space="preserve">Big Data &amp; Distributed Systems: </w:t>
+        <w:t xml:space="preserve">Visualization Tools: </w:t>
       </w:r>
       <w:r>
         <w:rPr>
           <w:b w:val="0"/>
           <w:sz w:val="22"/>
         </w:rPr>
-        <w:t>HDFS, MapReduce, Pig, Hive, Sqoop, Impala, Zookeeper, Flume, Kafka, Yarn, Cloudera Manager, PySpark, Airflow, Spark Components, Apache Nifi, Apache Spark, Spark SQL</w:t>
+        <w:t>Power BI, Tableau, AWS QuickSight</w:t>
       </w:r>
     </w:p>
     <w:p>
@@ -262,14 +409,14 @@
           <w:color w:val="000000"/>
           <w:sz w:val="22"/>
         </w:rPr>
-        <w:t xml:space="preserve">Data Visualization &amp; BI: </w:t>
+        <w:t xml:space="preserve">AI/ML &amp; GenAI: </w:t>
       </w:r>
       <w:r>
         <w:rPr>
           <w:b w:val="0"/>
           <w:sz w:val="22"/>
         </w:rPr>
-        <w:t>Power BI, Tableau</w:t>
+        <w:t>LLM, M-Llib, Scikit-learn, pandas, NumPy, pytorch, LangChain, RAG, GPT, Prompt Engineering</w:t>
       </w:r>
     </w:p>
     <w:p>
@@ -283,28 +430,52 @@
           <w:color w:val="000000"/>
           <w:sz w:val="22"/>
         </w:rPr>
-        <w:t xml:space="preserve">ML &amp; Data Science: </w:t>
+        <w:t xml:space="preserve">Others: </w:t>
       </w:r>
       <w:r>
         <w:rPr>
           <w:b w:val="0"/>
           <w:sz w:val="22"/>
         </w:rPr>
-        <w:t>Machine Learning, Statistical Modeling, LLM, M-Llib, TensorFlow, Computer Vision, Scikit-learn, pandas, NumPy, pytorch, LangChain, RAG, GPT, Prompt Engineering</w:t>
+        <w:t>Data Governance, Data Quality Frameworks, Agile, Jira, Confluence</w:t>
       </w:r>
     </w:p>
-    <w:p>
-      <w:pPr>
-        <w:spacing w:before="120"/>
-      </w:pPr>
-      <w:r>
-        <w:rPr>
-          <w:b/>
-          <w:sz w:val="24"/>
-        </w:rPr>
-        <w:t>Professional Experience</w:t>
-      </w:r>
-    </w:p>
+    <w:tbl>
+      <w:tblPr>
+        <w:tblStyle w:val="TableGrid"/>
+        <w:tblW w:type="auto" w:w="0"/>
+        <w:tblLayout w:type="fixed"/>
+        <w:tblLook w:firstColumn="1" w:firstRow="1" w:lastColumn="0" w:lastRow="0" w:noHBand="0" w:noVBand="1" w:val="04A0"/>
+      </w:tblPr>
+      <w:tblGrid>
+        <w:gridCol w:w="9000"/>
+      </w:tblGrid>
+      <w:tr>
+        <w:tc>
+          <w:tcPr>
+            <w:tcW w:type="dxa" w:w="10800"/>
+            <w:tcBorders>
+              <w:top w:val="nil"/>
+              <w:left w:val="nil"/>
+              <w:right w:val="nil"/>
+              <w:bottom w:val="single" w:sz="6" w:space="0" w:color="000000"/>
+            </w:tcBorders>
+          </w:tcPr>
+          <w:p>
+            <w:pPr>
+              <w:spacing w:after="120"/>
+            </w:pPr>
+            <w:r>
+              <w:rPr>
+                <w:b/>
+                <w:sz w:val="24"/>
+              </w:rPr>
+              <w:t>Professional Experience</w:t>
+            </w:r>
+          </w:p>
+        </w:tc>
+      </w:tr>
+    </w:tbl>
     <w:tbl>
       <w:tblPr>
         <w:tblW w:type="auto" w:w="0"/>
@@ -326,7 +497,7 @@
                 <w:b/>
                 <w:color w:val="000000"/>
               </w:rPr>
-              <w:t>Role: Senior Data Engineer</w:t>
+              <w:t>Role: Azure Data Engineer</w:t>
             </w:r>
           </w:p>
           <w:p>
@@ -352,7 +523,7 @@
                 <w:b/>
                 <w:color w:val="000000"/>
               </w:rPr>
-              <w:t>Apr 2024 - Present</w:t>
+              <w:t>April 2024 – Present</w:t>
             </w:r>
           </w:p>
         </w:tc>
@@ -378,7 +549,7 @@
         <w:rPr>
           <w:sz w:val="22"/>
         </w:rPr>
-        <w:t>Directed the design and development of a data mart on the CDP layer, integrating 22 AI models for automated report generation and enhanced real-time analytics.</w:t>
+        <w:t>Designed and implemented enterprise-grade ETL pipelines with Azure Databricks and Apache Spark, processing 10TB of insurance policy data daily for underwriting and risk analysis.</w:t>
       </w:r>
     </w:p>
     <w:p>
@@ -390,7 +561,7 @@
         <w:rPr>
           <w:sz w:val="22"/>
         </w:rPr>
-        <w:t>Engineered and optimized enterprise-level ETL pipelines using Azure Databricks, Apache Spark, and partitioning techniques to process 10TB of insurance policy data daily.</w:t>
+        <w:t>Led the architecture and development of a Data Mart in the CDP Layer, feeding data to 22 AI models and enhancing real-time analytics.</w:t>
       </w:r>
     </w:p>
     <w:p>
@@ -402,7 +573,7 @@
         <w:rPr>
           <w:sz w:val="22"/>
         </w:rPr>
-        <w:t>Architected a Data Mart in the CDP layer, fueling AI models and streamlining data-driven insights for underwriting and risk analysis.</w:t>
+        <w:t>Implemented medallion architecture in Azure Databricks for PNC's CDP Layer, optimizing data processing and scalability.</w:t>
       </w:r>
     </w:p>
     <w:p>
@@ -414,7 +585,7 @@
         <w:rPr>
           <w:sz w:val="22"/>
         </w:rPr>
-        <w:t>Conducted exploratory data analysis (EDA) and medallion architecture design in Azure Databricks for robust data preparation and transformation.</w:t>
+        <w:t>Migrated legacy ETL workflows from Hadoop to Azure cloud, reducing operational costs and improving performance.</w:t>
       </w:r>
     </w:p>
     <w:p>
@@ -426,7 +597,7 @@
         <w:rPr>
           <w:sz w:val="22"/>
         </w:rPr>
-        <w:t>Migrated legacy ETL/ELT workflows from Hadoop to Azure Cloud, reducing costs by 30% and improving performance.</w:t>
+        <w:t>Built and managed Delta Lake tables, utilizing partitioning and Z-order optimization for faster data processing and accessibility.</w:t>
       </w:r>
     </w:p>
     <w:p>
@@ -438,7 +609,7 @@
         <w:rPr>
           <w:sz w:val="22"/>
         </w:rPr>
-        <w:t>Developed reusable data ingestion frameworks with Azure Data Factory, NiFi, and Python, integrating diverse data sources into Azure Data Lake and Synapse Analytics.</w:t>
+        <w:t>Developed reusable data ingestion frameworks with Azure Data Factory, NiFi, and Python, integrating various data sources into Azure Data Lake and Synapse.</w:t>
       </w:r>
     </w:p>
     <w:p>
@@ -450,7 +621,7 @@
         <w:rPr>
           <w:sz w:val="22"/>
         </w:rPr>
-        <w:t>Implemented real-time streaming pipelines using Kafka, Azure Databricks, and Azure Cosmos DB for policy updates and downstream systems.</w:t>
+        <w:t>Implemented real-time streaming pipelines using Kafka and Azure Databricks for policy updates and downstream systems integration.</w:t>
       </w:r>
     </w:p>
     <w:p>
@@ -462,7 +633,7 @@
         <w:rPr>
           <w:sz w:val="22"/>
         </w:rPr>
-        <w:t>Established data quality frameworks with PySpark in Azure Databricks for schema validation, anomaly detection, and data integrity.</w:t>
+        <w:t>Integrated data quality frameworks in PySpark for schema validation, anomaly detection, and data integrity.</w:t>
       </w:r>
     </w:p>
     <w:p>
@@ -474,7 +645,7 @@
         <w:rPr>
           <w:sz w:val="22"/>
         </w:rPr>
-        <w:t>Configured Change Data Capture (CDC) and automated incremental data loads, ensuring seamless source change monitoring.</w:t>
+        <w:t>Automated CI/CD workflows with Azure DevOps for seamless data pipeline updates and smooth environment transitions.</w:t>
       </w:r>
     </w:p>
     <w:p>
@@ -486,31 +657,7 @@
         <w:rPr>
           <w:sz w:val="22"/>
         </w:rPr>
-        <w:t>Automated CI/CD workflows with Azure DevOps for efficient pipeline deployment and continuous integration.</w:t>
-      </w:r>
-    </w:p>
-    <w:p>
-      <w:pPr>
-        <w:pStyle w:val="ListBullet"/>
-        <w:jc w:val="both"/>
-      </w:pPr>
-      <w:r>
-        <w:rPr>
-          <w:sz w:val="22"/>
-        </w:rPr>
-        <w:t>Applied data normalization and ACID-compliant Delta Lake storage, reducing downstream errors and enhancing ETL reliability.</w:t>
-      </w:r>
-    </w:p>
-    <w:p>
-      <w:pPr>
-        <w:pStyle w:val="ListBullet"/>
-        <w:jc w:val="both"/>
-      </w:pPr>
-      <w:r>
-        <w:rPr>
-          <w:sz w:val="22"/>
-        </w:rPr>
-        <w:t>Utilized Agile methodologies via Azure Boards to manage project timelines and deliver timely data modernization initiatives.</w:t>
+        <w:t>Utilized Agile methodologies with Azure Boards for efficient project management and timely delivery.</w:t>
       </w:r>
     </w:p>
     <w:p>
@@ -532,7 +679,7 @@
         <w:rPr>
           <w:b w:val="0"/>
         </w:rPr>
-        <w:t>Azure, Azure Databricks, Apache Spark, Azure Data Factory, NiFi, Python, Azure Data Lake, Synapse Analytics, Kafka, Azure Cosmos DB, PySpark, Azure DevOps, Azure Boards</w:t>
+        <w:t>Azure Databricks, Databricks Unity Catalog, ADF, Azure Data Lake Storage Gen2, Azure Synapse Analytics, Azure Blob Storage, Azure SQL, Azure Key Vault, Azure Functions, Azure DevOps, Apache Spark, PySpark, Delta Lake, Apache Kafka, Spark Structured Streaming, HDFS, Apache NiFi, SQL Server, SQL Server Management Studio(SSMS), Kubernetes, GitHub, Row-Level Security, Column Masking, Encryption, LangChain, OpenAI APIs, Python</w:t>
       </w:r>
     </w:p>
     <w:tbl>
@@ -582,7 +729,7 @@
                 <w:b/>
                 <w:color w:val="000000"/>
               </w:rPr>
-              <w:t>Dec 2020 - Sep 2023</w:t>
+              <w:t>Dec 2020 – Sept 2023</w:t>
             </w:r>
           </w:p>
         </w:tc>
@@ -608,7 +755,7 @@
         <w:rPr>
           <w:sz w:val="22"/>
         </w:rPr>
-        <w:t>Streamlined data processing and analytics using AWS Glue, Apache Spark, and Python, driving efficient ETL pipelines and secure data lake implementations on Amazon S3.</w:t>
+        <w:t>Designed and implemented scalable ETL pipelines using AWS Glue, Apache Spark (PySpark), and Python for financial and insurance data, enabling efficient loan application and claims processing.</w:t>
       </w:r>
     </w:p>
     <w:p>
@@ -620,7 +767,7 @@
         <w:rPr>
           <w:sz w:val="22"/>
         </w:rPr>
-        <w:t>Constructed production-grade ETL pipelines with AWS Glue and PySpark, featuring advanced error handling and L3 support, processing over 2TB of transactional data.</w:t>
+        <w:t>Managed a secure data lake architecture on Amazon S3 with AWS Lake Formation and Macie for access control and GDPR compliance.</w:t>
       </w:r>
     </w:p>
     <w:p>
@@ -632,7 +779,7 @@
         <w:rPr>
           <w:sz w:val="22"/>
         </w:rPr>
-        <w:t>Managed a secure data lake architecture with AWS Lake Formation, AWS Macie, and real-time processing via AWS Lambda and Apache Kafka for insurance and loan data.</w:t>
+        <w:t>Utilized AWS Lambda and Apache Kafka for serverless and real-time processing of insurance and loan data.</w:t>
       </w:r>
     </w:p>
     <w:p>
@@ -644,7 +791,7 @@
         <w:rPr>
           <w:sz w:val="22"/>
         </w:rPr>
-        <w:t>Migrated legacy Oracle RDBMS data to AWS cloud services (S3, Redshift), optimizing query performance with advanced Redshift techniques for faster execution.</w:t>
+        <w:t>Migrated legacy RDBMS data (Oracle) to AWS cloud services (S3, Redshift) for centralized processing, optimizing Redshift for faster query performance.</w:t>
       </w:r>
     </w:p>
     <w:p>
@@ -656,7 +803,7 @@
         <w:rPr>
           <w:sz w:val="22"/>
         </w:rPr>
-        <w:t>Engineered scalable data ingestion workflows by integrating AWS Athena for semi-structured data querying, enhancing ad-hoc analytics capabilities.</w:t>
+        <w:t>Developed REST APIs using Flask and Python to expose loan and insurance datasets for internal applications.</w:t>
       </w:r>
     </w:p>
     <w:p>
@@ -668,7 +815,7 @@
         <w:rPr>
           <w:sz w:val="22"/>
         </w:rPr>
-        <w:t>Designed incremental data flows using CDC and Databricks for near real-time ingestion of policy updates, improving latency-sensitive reporting systems.</w:t>
+        <w:t>Integrated Salesforce, ServiceNow, and SAP data into the AWS data lake for unified customer analytics and real-time insights.</w:t>
       </w:r>
     </w:p>
     <w:p>
@@ -680,7 +827,7 @@
         <w:rPr>
           <w:sz w:val="22"/>
         </w:rPr>
-        <w:t>Developed and maintained stored procedures in SQL Server and Redshift to automate transformation logic and ensure consistency across ETL jobs.</w:t>
+        <w:t>Built scalable data ingestion workflows with AWS Athena for ad-hoc analytics on semi-structured data in S3.</w:t>
       </w:r>
     </w:p>
     <w:p>
@@ -692,31 +839,7 @@
         <w:rPr>
           <w:sz w:val="22"/>
         </w:rPr>
-        <w:t>Orchestrated AWS Step Functions for automated multi-stage Glue ETL jobs and Lambda data validation, reducing manual effort in insurance claim processing.</w:t>
-      </w:r>
-    </w:p>
-    <w:p>
-      <w:pPr>
-        <w:pStyle w:val="ListBullet"/>
-        <w:jc w:val="both"/>
-      </w:pPr>
-      <w:r>
-        <w:rPr>
-          <w:sz w:val="22"/>
-        </w:rPr>
-        <w:t>Adopted Medallion Architecture best practices within AWS-integrated Databricks pipelines, enhancing data quality assurance and modular transformations.</w:t>
-      </w:r>
-    </w:p>
-    <w:p>
-      <w:pPr>
-        <w:pStyle w:val="ListBullet"/>
-        <w:jc w:val="both"/>
-      </w:pPr>
-      <w:r>
-        <w:rPr>
-          <w:sz w:val="22"/>
-        </w:rPr>
-        <w:t>Streamlined ETL pipeline deployment and testing by implementing Agile and DevOps practices with GitHub Actions and AWS Glue Data Catalog management.</w:t>
+        <w:t>Implemented CI/CD workflows with GitHub Actions for automated testing and ETL pipeline deployment, ensuring efficient schema management with AWS Glue Data Catalog.</w:t>
       </w:r>
     </w:p>
     <w:p>
@@ -738,7 +861,7 @@
         <w:rPr>
           <w:b w:val="0"/>
         </w:rPr>
-        <w:t>AWS, AWS Glue, PySpark, Amazon S3, AWS Lake Formation, AWS Macie, AWS Lambda, Apache Kafka, Oracle, AWS Redshift, AWS Athena, CDC, Databricks, SQL Server, AWS Step Functions, GitHub Actions, AWS Glue Data Catalog</w:t>
+        <w:t>AWS Glue, Amazon S3, AWS Lake Formation, AWS Lambda, Redshift, AWS Macie, AWS Step Functions, AWS Glue Data Catalog, DMS, CloudWatch, CloudFormation, AWS Sage Maker, Apache Spark, PySpark, Apache Kafka, Spark Streaming, Oracle, Python, Flask, Airflow, GitHub Actions, Salesforce Sales Cloud, SAP, ServiceNow, Redis, Power BI, Amazon QuickSight</w:t>
       </w:r>
     </w:p>
     <w:tbl>
@@ -771,7 +894,7 @@
                 <w:b/>
                 <w:color w:val="000000"/>
               </w:rPr>
-              <w:t>Client: Cipla pharmaceuticals</w:t>
+              <w:t>Client: Cipla pharmaceuticals – Bengaluru, India</w:t>
             </w:r>
           </w:p>
         </w:tc>
@@ -788,7 +911,7 @@
                 <w:b/>
                 <w:color w:val="000000"/>
               </w:rPr>
-              <w:t>Jan 2020 - Dec 2020</w:t>
+              <w:t>Jan 2019 – Dec 2020</w:t>
             </w:r>
           </w:p>
         </w:tc>
@@ -814,7 +937,7 @@
         <w:rPr>
           <w:sz w:val="22"/>
         </w:rPr>
-        <w:t>Modernized Cipla's healthcare data infrastructure by integrating clinical, operational, and patient data into a hybrid cloud platform, enabling real-time insights for drug development and regulatory compliance.</w:t>
+        <w:t>Architected a hybrid cloud platform using on-premise Hadoop (HDFS, Hive, Spark) and Azure services (Data Lake Storage, Synapse Analytics, Data Factory, Databricks) to process large-scale healthcare datasets.</w:t>
       </w:r>
     </w:p>
     <w:p>
@@ -826,7 +949,7 @@
         <w:rPr>
           <w:sz w:val="22"/>
         </w:rPr>
-        <w:t>Engineered a hybrid cloud platform leveraging Hadoop (HDFS, Hive, Spark) and Azure services (Azure Data Lake Storage, Synapse Analytics, Azure Data Factory, Azure Databricks) for large-scale healthcare data processing.</w:t>
+        <w:t>Built secure, automated ETL pipelines with Azure Data Factory, integrating data from clinical systems, EHRs, and legacy databases into Azure SQL DB and Synapse for analytics.</w:t>
       </w:r>
     </w:p>
     <w:p>
@@ -838,7 +961,7 @@
         <w:rPr>
           <w:sz w:val="22"/>
         </w:rPr>
-        <w:t>Constructed secure and automated ETL pipelines with Azure Data Factory, integrating data from clinical systems, EHRs, and legacy databases into Azure SQL DB and Synapse for scalable analytics.</w:t>
+        <w:t>Developed real-time streaming workflows using Apache Kafka, Azure Event Hubs, and Structured Streaming in Azure Databricks for live clinical data processing.</w:t>
       </w:r>
     </w:p>
     <w:p>
@@ -850,7 +973,7 @@
         <w:rPr>
           <w:sz w:val="22"/>
         </w:rPr>
-        <w:t>Developed HIPAA-compliant data pipelines for pharmaceutical clinical trials, servicing 10M+ patient records with stringent data governance standards.</w:t>
+        <w:t>Modeled healthcare-specific data marts with dbt, deployed on Synapse, providing insights on adverse events, patient adherence, and treatment outcomes.</w:t>
       </w:r>
     </w:p>
     <w:p>
@@ -862,7 +985,7 @@
         <w:rPr>
           <w:sz w:val="22"/>
         </w:rPr>
-        <w:t>Implemented real-time streaming workflows using Apache Kafka, Azure Event Hubs, and Structured Streaming in Azure Databricks for live clinical data handling and supply chain telemetry.</w:t>
+        <w:t>Migrated on-prem systems (Oracle, Teradata, Hadoop) to Azure cloud using Azure Database Migration Service and Terraform, ensuring zero data loss.</w:t>
       </w:r>
     </w:p>
     <w:p>
@@ -874,7 +997,7 @@
         <w:rPr>
           <w:sz w:val="22"/>
         </w:rPr>
-        <w:t>Modeled healthcare-specific data marts with dbt on Synapse, providing insights on adverse events, patient adherence, and treatment outcomes.</w:t>
+        <w:t>Implemented data governance and compliance controls with Azure Purview, RBAC, Key Vault, and data encryption.</w:t>
       </w:r>
     </w:p>
     <w:p>
@@ -886,7 +1009,7 @@
         <w:rPr>
           <w:sz w:val="22"/>
         </w:rPr>
-        <w:t>Maintained reliable data replication from SaaS platforms to Snowflake using Fivetran and Matillion.</w:t>
+        <w:t>Automated deployment workflows via Azure DevOps, integrating PyTest for TDD, enabling consistent versioning and CI/CD for data pipelines.</w:t>
       </w:r>
     </w:p>
     <w:p>
@@ -898,31 +1021,7 @@
         <w:rPr>
           <w:sz w:val="22"/>
         </w:rPr>
-        <w:t>Designed interactive dashboards in Power BI leveraging DAX, Power Query, and Power BI Service for efficient visualization and scheduled reporting.</w:t>
-      </w:r>
-    </w:p>
-    <w:p>
-      <w:pPr>
-        <w:pStyle w:val="ListBullet"/>
-        <w:jc w:val="both"/>
-      </w:pPr>
-      <w:r>
-        <w:rPr>
-          <w:sz w:val="22"/>
-        </w:rPr>
-        <w:t>Instituted data governance and compliance measures with Azure Purview, RBAC, Key Vault, and data encryption, ensuring data security.</w:t>
-      </w:r>
-    </w:p>
-    <w:p>
-      <w:pPr>
-        <w:pStyle w:val="ListBullet"/>
-        <w:jc w:val="both"/>
-      </w:pPr>
-      <w:r>
-        <w:rPr>
-          <w:sz w:val="22"/>
-        </w:rPr>
-        <w:t>Applied Infrastructure as Code (IaC) principles with Terraform to automate and version-control cloud resource provisioning.</w:t>
+        <w:t>Utilized Azure Monitor and Log Analytics for performance tracking and issue identification.</w:t>
       </w:r>
     </w:p>
     <w:p>
@@ -944,21 +1043,45 @@
         <w:rPr>
           <w:b w:val="0"/>
         </w:rPr>
-        <w:t>Azure, Hadoop, HDFS, Hive, Spark, Azure Data Lake Storage (Gen2), Azure Synapse Analytics, Azure Data Factory, Azure Databricks, Apache Kafka, Azure Event Hubs, Structured Streaming, Azure SQL DB, HIPAA, dbt, Snowflake, Fivetran, Matillion, Power BI, DAX, Power Query, Azure Purview, RBAC, Key Vault, Terraform</w:t>
+        <w:t>Azure Data Factory, Azure Synapse Analytics, Snowflake, Databricks, Delta Lake, Apache Spark, PySpark, Scala, SQL, Apache Kafka, Azure Event Hubs, Azure Stream Analytics, Power BI, Azure Cosmos DB, ADLS Gen2, HDFS, Hive, Pig, HBase, MapReduce, Sqoop, Flume, Zookeeper, Azure DevOps, Terraform, GitHub, Azure Monitor, Log Analytics, KQL, Azure Purview, Databricks Unity Catalog, RBAC, YAML, Azure Repos, Jira, Scrum, Agile</w:t>
       </w:r>
     </w:p>
-    <w:p>
-      <w:pPr>
-        <w:spacing w:before="120"/>
-      </w:pPr>
-      <w:r>
-        <w:rPr>
-          <w:b/>
-          <w:sz w:val="24"/>
-        </w:rPr>
-        <w:t>Education</w:t>
-      </w:r>
-    </w:p>
+    <w:tbl>
+      <w:tblPr>
+        <w:tblStyle w:val="TableGrid"/>
+        <w:tblW w:type="auto" w:w="0"/>
+        <w:tblLayout w:type="fixed"/>
+        <w:tblLook w:firstColumn="1" w:firstRow="1" w:lastColumn="0" w:lastRow="0" w:noHBand="0" w:noVBand="1" w:val="04A0"/>
+      </w:tblPr>
+      <w:tblGrid>
+        <w:gridCol w:w="9000"/>
+      </w:tblGrid>
+      <w:tr>
+        <w:tc>
+          <w:tcPr>
+            <w:tcW w:type="dxa" w:w="10800"/>
+            <w:tcBorders>
+              <w:top w:val="nil"/>
+              <w:left w:val="nil"/>
+              <w:right w:val="nil"/>
+              <w:bottom w:val="single" w:sz="6" w:space="0" w:color="000000"/>
+            </w:tcBorders>
+          </w:tcPr>
+          <w:p>
+            <w:pPr>
+              <w:spacing w:after="120"/>
+            </w:pPr>
+            <w:r>
+              <w:rPr>
+                <w:b/>
+                <w:sz w:val="24"/>
+              </w:rPr>
+              <w:t>Education</w:t>
+            </w:r>
+          </w:p>
+        </w:tc>
+      </w:tr>
+    </w:tbl>
     <w:p>
       <w:r>
         <w:rPr>
@@ -971,16 +1094,52 @@
         <w:t>in Information Technology with a concentration in Artificial Intelligence and Data Analytics | University of Wisconsin-Milwaukee</w:t>
       </w:r>
     </w:p>
+    <w:tbl>
+      <w:tblPr>
+        <w:tblStyle w:val="TableGrid"/>
+        <w:tblW w:type="auto" w:w="0"/>
+        <w:tblLayout w:type="fixed"/>
+        <w:tblLook w:firstColumn="1" w:firstRow="1" w:lastColumn="0" w:lastRow="0" w:noHBand="0" w:noVBand="1" w:val="04A0"/>
+      </w:tblPr>
+      <w:tblGrid>
+        <w:gridCol w:w="9000"/>
+      </w:tblGrid>
+      <w:tr>
+        <w:tc>
+          <w:tcPr>
+            <w:tcW w:type="dxa" w:w="10800"/>
+            <w:tcBorders>
+              <w:top w:val="nil"/>
+              <w:left w:val="nil"/>
+              <w:right w:val="nil"/>
+              <w:bottom w:val="single" w:sz="6" w:space="0" w:color="000000"/>
+            </w:tcBorders>
+          </w:tcPr>
+          <w:p>
+            <w:pPr>
+              <w:spacing w:after="120"/>
+            </w:pPr>
+            <w:r>
+              <w:rPr>
+                <w:b/>
+                <w:sz w:val="24"/>
+              </w:rPr>
+              <w:t>Certifications</w:t>
+            </w:r>
+          </w:p>
+        </w:tc>
+      </w:tr>
+    </w:tbl>
     <w:p>
       <w:pPr>
-        <w:spacing w:before="120"/>
+        <w:pStyle w:val="ListBullet"/>
+        <w:jc w:val="both"/>
       </w:pPr>
       <w:r>
         <w:rPr>
-          <w:b/>
-          <w:sz w:val="24"/>
+          <w:sz w:val="22"/>
         </w:rPr>
-        <w:t>Certifications</w:t>
+        <w:t>Azure Data Engineer –DP203</w:t>
       </w:r>
     </w:p>
     <w:p>
@@ -992,7 +1151,7 @@
         <w:rPr>
           <w:sz w:val="22"/>
         </w:rPr>
-        <w:t>Azure Certified Data Engineer</w:t>
+        <w:t>Azure AI Engineer-AI101</w:t>
       </w:r>
     </w:p>
     <w:p>
@@ -1004,7 +1163,7 @@
         <w:rPr>
           <w:sz w:val="22"/>
         </w:rPr>
-        <w:t>Azure Certified Engineer</w:t>
+        <w:t>AWS Data Engineer Associate</w:t>
       </w:r>
     </w:p>
     <w:p>
@@ -1016,19 +1175,7 @@
         <w:rPr>
           <w:sz w:val="22"/>
         </w:rPr>
-        <w:t>AWS Certified Data Engineer</w:t>
-      </w:r>
-    </w:p>
-    <w:p>
-      <w:pPr>
-        <w:pStyle w:val="ListBullet"/>
-        <w:jc w:val="both"/>
-      </w:pPr>
-      <w:r>
-        <w:rPr>
-          <w:sz w:val="22"/>
-        </w:rPr>
-        <w:t>Certified Salesforce Developer</w:t>
+        <w:t>Salesforce Developer-Associate</w:t>
       </w:r>
     </w:p>
     <w:sectPr>

</xml_diff>